<commit_message>
Add AEJ Microeconomics R&R status for cloud paper
</commit_message>
<xml_diff>
--- a/files/ChuqingJin_CV.docx
+++ b/files/ChuqingJin_CV.docx
@@ -539,6 +539,18 @@
           <w:szCs w:val="22"/>
         </w:rPr>
         <w:t>Firm Inertia in the Public Cloud,” (with Sida Peng and Peichun Wang), July 2026.</w:t>
+      </w:r>
+      <w:r>
+        <w:t xml:space="preserve"> Revise and resubmit, </w:t>
+      </w:r>
+      <w:r>
+        <w:rPr>
+          <w:i/>
+        </w:rPr>
+        <w:t>American Economic Journal: Microeconomics</w:t>
+      </w:r>
+      <w:r>
+        <w:t>.</w:t>
       </w:r>
     </w:p>
     <w:p>

</xml_diff>

<commit_message>
Match CV R&R font size to surrounding text
</commit_message>
<xml_diff>
--- a/files/ChuqingJin_CV.docx
+++ b/files/ChuqingJin_CV.docx
@@ -541,15 +541,25 @@
         <w:t>Firm Inertia in the Public Cloud,” (with Sida Peng and Peichun Wang), July 2026.</w:t>
       </w:r>
       <w:r>
+        <w:rPr>
+          <w:sz w:val="22"/>
+          <w:szCs w:val="22"/>
+        </w:rPr>
         <w:t xml:space="preserve"> Revise and resubmit, </w:t>
       </w:r>
       <w:r>
         <w:rPr>
           <w:i/>
+          <w:sz w:val="22"/>
+          <w:szCs w:val="22"/>
         </w:rPr>
         <w:t>American Economic Journal: Microeconomics</w:t>
       </w:r>
       <w:r>
+        <w:rPr>
+          <w:sz w:val="22"/>
+          <w:szCs w:val="22"/>
+        </w:rPr>
         <w:t>.</w:t>
       </w:r>
     </w:p>

</xml_diff>

<commit_message>
Add Allison Mintzer and Shuo Song to CV advising
</commit_message>
<xml_diff>
--- a/files/ChuqingJin_CV.docx
+++ b/files/ChuqingJin_CV.docx
@@ -1551,6 +1551,7 @@
     <w:p>
       <w:pPr>
         <w:pStyle w:val="Normal"/>
+        <w:keepNext/>
         <w:numPr>
           <w:ilvl w:val="0"/>
           <w:numId w:val="0"/>
@@ -1576,6 +1577,7 @@
     <w:p>
       <w:pPr>
         <w:pStyle w:val="Normal"/>
+        <w:keepNext/>
         <w:numPr>
           <w:ilvl w:val="0"/>
           <w:numId w:val="0"/>
@@ -1598,6 +1600,53 @@
     <w:p>
       <w:pPr>
         <w:pStyle w:val="Normal"/>
+        <w:keepNext/>
+        <w:numPr>
+          <w:ilvl w:val="0"/>
+          <w:numId w:val="0"/>
+        </w:numPr>
+        <w:ind w:hanging="360" w:start="720" w:end="0"/>
+        <w:outlineLvl w:val="0"/>
+        <w:rPr>
+          <w:sz w:val="22"/>
+          <w:szCs w:val="22"/>
+        </w:rPr>
+      </w:pPr>
+      <w:r>
+        <w:rPr>
+          <w:sz w:val="22"/>
+          <w:szCs w:val="22"/>
+        </w:rPr>
+        <w:t>Shuo Song (PhD, in progress)</w:t>
+      </w:r>
+    </w:p>
+    <w:p>
+      <w:pPr>
+        <w:pStyle w:val="Normal"/>
+        <w:keepNext/>
+        <w:numPr>
+          <w:ilvl w:val="0"/>
+          <w:numId w:val="0"/>
+        </w:numPr>
+        <w:ind w:firstLine="360" w:end="0"/>
+        <w:outlineLvl w:val="0"/>
+        <w:rPr>
+          <w:sz w:val="22"/>
+          <w:szCs w:val="22"/>
+        </w:rPr>
+      </w:pPr>
+      <w:r>
+        <w:rPr>
+          <w:sz w:val="22"/>
+          <w:szCs w:val="22"/>
+        </w:rPr>
+        <w:t>Allison Mintzer (Master, 2026)</w:t>
+      </w:r>
+    </w:p>
+    <w:p>
+      <w:pPr>
+        <w:pStyle w:val="Normal"/>
+        <w:keepNext/>
         <w:numPr>
           <w:ilvl w:val="0"/>
           <w:numId w:val="0"/>

</xml_diff>